<commit_message>
Update documents and add new individual acceptance letters
</commit_message>
<xml_diff>
--- a/docs/2. CARTA DE ACEITE INDIVIDUAL EM GRUPO 1 (grupo) - .docx
+++ b/docs/2. CARTA DE ACEITE INDIVIDUAL EM GRUPO 1 (grupo) - .docx
@@ -216,6 +216,7 @@
             <w:placeholder>
               <w:docPart w:val="B9ADA93D1E114F4D9B12C705F3104CA5"/>
             </w:placeholder>
+            <w:showingPlcHdr/>
           </w:sdtPr>
           <w:sdtContent>
             <w:tc>
@@ -234,10 +235,10 @@
                   </w:rPr>
                 </w:pPr>
                 <w:r>
-                  <w:t xml:space="preserve"> </w:t>
-                </w:r>
-                <w:r>
-                  <w:t>Manoel Pedro Prado Sá Teles</w:t>
+                  <w:rPr>
+                    <w:rStyle w:val="TextodoEspaoReservado"/>
+                  </w:rPr>
+                  <w:t>Clique ou toque aqui para inserir o texto.</w:t>
                 </w:r>
               </w:p>
             </w:tc>
@@ -295,9 +296,6 @@
                 <w:r>
                   <w:t xml:space="preserve"> </w:t>
                 </w:r>
-                <w:r>
-                  <w:t>UC24102766</w:t>
-                </w:r>
               </w:p>
             </w:tc>
           </w:sdtContent>
@@ -351,9 +349,6 @@
                 <w:r>
                   <w:t xml:space="preserve"> </w:t>
                 </w:r>
-                <w:r>
-                  <w:t>105.224.295-21</w:t>
-                </w:r>
               </w:p>
             </w:tc>
           </w:sdtContent>
@@ -393,6 +388,7 @@
             <w:placeholder>
               <w:docPart w:val="D1C9F247EDA14899B457CFFB3101CA78"/>
             </w:placeholder>
+            <w:showingPlcHdr/>
           </w:sdtPr>
           <w:sdtContent>
             <w:tc>
@@ -408,10 +404,10 @@
                   </w:rPr>
                 </w:pPr>
                 <w:r>
-                  <w:t xml:space="preserve"> </w:t>
-                </w:r>
-                <w:r>
-                  <w:t>(73) 998481162</w:t>
+                  <w:rPr>
+                    <w:rStyle w:val="TextodoEspaoReservado"/>
+                  </w:rPr>
+                  <w:t>Clique ou toque aqui para inserir o texto.</w:t>
                 </w:r>
               </w:p>
             </w:tc>
@@ -471,9 +467,6 @@
                 </w:pPr>
                 <w:r>
                   <w:t xml:space="preserve"> </w:t>
-                </w:r>
-                <w:r>
-                  <w:t>manoel.teles@a.ucb.br</w:t>
                 </w:r>
               </w:p>
             </w:tc>
@@ -648,43 +641,16 @@
                     <w:rFonts w:ascii="Arial" w:hAnsi="Arial" w:cs="Arial"/>
                   </w:rPr>
                 </w:pPr>
-                <w:r>
-                  <w:rPr>
-                    <w:rFonts w:ascii="Arial" w:hAnsi="Arial" w:cs="Arial"/>
-                  </w:rPr>
-                  <w:fldChar w:fldCharType="begin"/>
-                </w:r>
-                <w:r>
-                  <w:rPr>
-                    <w:rFonts w:ascii="Arial" w:hAnsi="Arial" w:cs="Arial"/>
-                  </w:rPr>
-                  <w:instrText>HYPERLINK "ranyelson.carvalho@p.ucb.br"</w:instrText>
-                </w:r>
-                <w:r>
-                  <w:rPr>
-                    <w:rFonts w:ascii="Arial" w:hAnsi="Arial" w:cs="Arial"/>
-                  </w:rPr>
-                </w:r>
-                <w:r>
-                  <w:rPr>
-                    <w:rFonts w:ascii="Arial" w:hAnsi="Arial" w:cs="Arial"/>
-                  </w:rPr>
-                  <w:fldChar w:fldCharType="separate"/>
-                </w:r>
-                <w:r>
-                  <w:rPr>
-                    <w:rStyle w:val="Hyperlink"/>
-                    <w:rFonts w:asciiTheme="minorHAnsi" w:eastAsiaTheme="minorHAnsi" w:hAnsiTheme="minorHAnsi" w:cstheme="minorBidi"/>
-                    <w:lang w:val="pt-BR"/>
-                  </w:rPr>
-                  <w:t>ranyelson.carvalho@p.ucb.br</w:t>
-                </w:r>
-                <w:r>
-                  <w:rPr>
-                    <w:rFonts w:ascii="Arial" w:hAnsi="Arial" w:cs="Arial"/>
-                  </w:rPr>
-                  <w:fldChar w:fldCharType="end"/>
-                </w:r>
+                <w:hyperlink r:id="rId8" w:history="1">
+                  <w:r>
+                    <w:rPr>
+                      <w:rStyle w:val="Hyperlink"/>
+                      <w:rFonts w:asciiTheme="minorHAnsi" w:eastAsiaTheme="minorHAnsi" w:hAnsiTheme="minorHAnsi" w:cstheme="minorBidi"/>
+                      <w:lang w:val="pt-BR"/>
+                    </w:rPr>
+                    <w:t>ranyelson.carvalho@p.ucb.br</w:t>
+                  </w:r>
+                </w:hyperlink>
               </w:p>
             </w:tc>
           </w:sdtContent>
@@ -1937,7 +1903,7 @@
                         </pic:cNvPicPr>
                       </pic:nvPicPr>
                       <pic:blipFill>
-                        <a:blip r:embed="rId8">
+                        <a:blip r:embed="rId9">
                           <a:extLst>
                             <a:ext uri="{28A0092B-C50C-407E-A947-70E740481C1C}">
                               <a14:useLocalDpi xmlns:a14="http://schemas.microsoft.com/office/drawing/2010/main" val="0"/>
@@ -1987,12 +1953,12 @@
       </w:r>
     </w:p>
     <w:sectPr>
-      <w:headerReference w:type="even" r:id="rId9"/>
-      <w:headerReference w:type="default" r:id="rId10"/>
-      <w:footerReference w:type="even" r:id="rId11"/>
-      <w:footerReference w:type="default" r:id="rId12"/>
-      <w:headerReference w:type="first" r:id="rId13"/>
-      <w:footerReference w:type="first" r:id="rId14"/>
+      <w:headerReference w:type="even" r:id="rId10"/>
+      <w:headerReference w:type="default" r:id="rId11"/>
+      <w:footerReference w:type="even" r:id="rId12"/>
+      <w:footerReference w:type="default" r:id="rId13"/>
+      <w:headerReference w:type="first" r:id="rId14"/>
+      <w:footerReference w:type="first" r:id="rId15"/>
       <w:pgSz w:w="11906" w:h="16838"/>
       <w:pgMar w:top="1440" w:right="1077" w:bottom="1134" w:left="1077" w:header="709" w:footer="709" w:gutter="0"/>
       <w:cols w:space="708"/>
@@ -2093,7 +2059,7 @@
         <w:noProof/>
         <w14:ligatures w14:val="standardContextual"/>
       </w:rPr>
-      <w:pict w14:anchorId="0F4B2C76">
+      <w:pict w14:anchorId="1ED31BD9">
         <v:shapetype id="_x0000_t75" coordsize="21600,21600" o:spt="75" o:preferrelative="t" path="m@4@5l@4@11@9@11@9@5xe" filled="f" stroked="f">
           <v:stroke joinstyle="miter"/>
           <v:formulas>
@@ -2134,7 +2100,7 @@
         <w:noProof/>
         <w14:ligatures w14:val="standardContextual"/>
       </w:rPr>
-      <w:pict w14:anchorId="5AB43C7F">
+      <w:pict w14:anchorId="659DE66E">
         <v:shapetype id="_x0000_t75" coordsize="21600,21600" o:spt="75" o:preferrelative="t" path="m@4@5l@4@11@9@11@9@5xe" filled="f" stroked="f">
           <v:stroke joinstyle="miter"/>
           <v:formulas>
@@ -2175,7 +2141,7 @@
         <w:noProof/>
         <w14:ligatures w14:val="standardContextual"/>
       </w:rPr>
-      <w:pict w14:anchorId="32E32DD3">
+      <w:pict w14:anchorId="0D0B3F7A">
         <v:shapetype id="_x0000_t75" coordsize="21600,21600" o:spt="75" o:preferrelative="t" path="m@4@5l@4@11@9@11@9@5xe" filled="f" stroked="f">
           <v:stroke joinstyle="miter"/>
           <v:formulas>
@@ -4287,10 +4253,12 @@
     <w:rsid w:val="004D2FDF"/>
     <w:rsid w:val="00620402"/>
     <w:rsid w:val="006275C3"/>
+    <w:rsid w:val="00660EE6"/>
     <w:rsid w:val="008911F4"/>
     <w:rsid w:val="00891959"/>
     <w:rsid w:val="008947E4"/>
     <w:rsid w:val="0096163A"/>
+    <w:rsid w:val="00A540EB"/>
     <w:rsid w:val="00B543F0"/>
     <w:rsid w:val="00B950F7"/>
     <w:rsid w:val="00B96F1D"/>

</xml_diff>